<commit_message>
Mascot in all guides: covers, TIP and TRAP boxes (EN/FR/NL/DE)
</commit_message>
<xml_diff>
--- a/source/de/0-what-an-ai-is.docx
+++ b/source/de/0-what-an-ai-is.docx
@@ -325,6 +325,7 @@
     </w:p>
     <w:tbl>
       <w:tblPr>
+        <w:tblLayout w:type="fixed"/>
         <w:tblW w:type="dxa" w:w="9546"/>
         <w:tblBorders>
           <w:top w:val="single" w:color="auto" w:sz="4"/>
@@ -336,7 +337,8 @@
         </w:tblBorders>
       </w:tblPr>
       <w:tblGrid>
-        <w:gridCol w:w="9546"/>
+        <w:gridCol w:w="1150"/>
+        <w:gridCol w:w="8396"/>
       </w:tblGrid>
       <w:tr>
         <w:trPr>
@@ -344,10 +346,68 @@
         </w:trPr>
         <w:tc>
           <w:tcPr>
-            <w:tcW w:type="dxa" w:w="9546"/>
+            <w:tcW w:type="dxa" w:w="1150"/>
             <w:tcBorders>
               <w:top w:val="single" w:color="2E7D32" w:sz="2"/>
               <w:left w:val="single" w:color="2E7D32" w:sz="18"/>
+              <w:bottom w:val="single" w:color="2E7D32" w:sz="2"/>
+              <w:right w:val="nil"/>
+            </w:tcBorders>
+            <w:shd w:fill="EAF3EA" w:val="clear"/>
+            <w:tcMar>
+              <w:top w:type="dxa" w:w="80"/>
+              <w:left w:type="dxa" w:w="120"/>
+              <w:bottom w:type="dxa" w:w="80"/>
+              <w:right w:type="dxa" w:w="60"/>
+            </w:tcMar>
+            <w:vAlign w:val="center"/>
+          </w:tcPr>
+          <w:p>
+            <w:pPr>
+              <w:spacing w:after="0"/>
+              <w:jc w:val="center"/>
+            </w:pPr>
+            <w:r>
+              <w:drawing>
+                <wp:inline distT="0" distB="0" distL="0" distR="0">
+                  <wp:extent cx="387692" cy="576000"/>
+                  <wp:docPr id="901" name="Mascot 1" descr="Mascot"/>
+                  <a:graphic xmlns:a="http://schemas.openxmlformats.org/drawingml/2006/main">
+                    <a:graphicData uri="http://schemas.openxmlformats.org/drawingml/2006/picture">
+                      <pic:pic xmlns:pic="http://schemas.openxmlformats.org/drawingml/2006/picture">
+                        <pic:nvPicPr>
+                          <pic:cNvPr id="901" name="img1.png"/>
+                          <pic:cNvPicPr/>
+                        </pic:nvPicPr>
+                        <pic:blipFill>
+                          <a:blip r:embed="rIdImg1"/>
+                          <a:stretch>
+                            <a:fillRect/>
+                          </a:stretch>
+                        </pic:blipFill>
+                        <pic:spPr>
+                          <a:xfrm>
+                            <a:off x="0" y="0"/>
+                            <a:ext cx="387692" cy="576000"/>
+                          </a:xfrm>
+                          <a:prstGeom prst="rect">
+                            <a:avLst/>
+                          </a:prstGeom>
+                        </pic:spPr>
+                      </pic:pic>
+                    </a:graphicData>
+                  </a:graphic>
+                </wp:inline>
+              </w:drawing>
+            </w:r>
+          </w:p>
+        </w:tc>
+        <w:tc>
+          <w:tcPr>
+            <w:tcW w:type="dxa" w:w="8396"/>
+            <w:tcBorders>
+              <w:top w:val="single" w:color="2E7D32" w:sz="2"/>
+              <w:left w:val="nil"/>
               <w:bottom w:val="single" w:color="2E7D32" w:sz="2"/>
               <w:right w:val="single" w:color="2E7D32" w:sz="2"/>
             </w:tcBorders>
@@ -358,6 +418,7 @@
               <w:bottom w:type="dxa" w:w="110"/>
               <w:right w:type="dxa" w:w="150"/>
             </w:tcMar>
+            <w:vAlign w:val="center"/>
           </w:tcPr>
           <w:p>
             <w:pPr>

</xml_diff>